<commit_message>
Expand VSM Operations Room and screens detail in System 4 doc and regenerate docx
</commit_message>
<xml_diff>
--- a/diseno_organizacional_synapta/9_sistema_4.docx
+++ b/diseno_organizacional_synapta/9_sistema_4.docx
@@ -3175,7 +3175,7 @@
           <w:sz w:val="22"/>
           <w:szCs w:val="22"/>
         </w:rPr>
-        <w:t xml:space="preserve">Sala de Operaciones Virtual</w:t>
+        <w:t xml:space="preserve">Sala de Operaciones Virtual (Operations Room)</w:t>
       </w:r>
       <w:r>
         <w:rPr>
@@ -3204,6 +3204,22 @@
     </w:p>
     <w:p>
       <w:pPr>
+        <w:pStyle w:val="Heading4"/>
+      </w:pPr>
+      <w:r>
+        <w:rPr>
+          <w:rFonts w:ascii="Arial" w:cs="Arial" w:eastAsia="Arial" w:hAnsi="Arial"/>
+          <w:b/>
+          <w:bCs/>
+          <w:color w:val="1B4F72"/>
+          <w:sz w:val="24"/>
+          <w:szCs w:val="24"/>
+        </w:rPr>
+        <w:t xml:space="preserve">Justificación y Diseño Teórico de la Sala de Operaciones</w:t>
+      </w:r>
+    </w:p>
+    <w:p>
+      <w:pPr>
         <w:spacing w:after="120"/>
       </w:pPr>
       <w:r>
@@ -3212,25 +3228,159 @@
           <w:sz w:val="22"/>
           <w:szCs w:val="22"/>
         </w:rPr>
-        <w:t xml:space="preserve">Siguiendo las directrices de José Pérez Ríos [2], la Sala de Operaciones Virtual se organiza en </w:t>
-      </w:r>
-      <w:r>
-        <w:rPr>
-          <w:rFonts w:ascii="Arial" w:cs="Arial" w:eastAsia="Arial" w:hAnsi="Arial"/>
-          <w:b/>
-          <w:bCs/>
-          <w:sz w:val="22"/>
-          <w:szCs w:val="22"/>
-        </w:rPr>
-        <w:t xml:space="preserve">5 pantallas específicas</w:t>
-      </w:r>
-      <w:r>
-        <w:rPr>
-          <w:rFonts w:ascii="Arial" w:cs="Arial" w:eastAsia="Arial" w:hAnsi="Arial"/>
-          <w:sz w:val="22"/>
-          <w:szCs w:val="22"/>
-        </w:rPr>
-        <w:t xml:space="preserve"> para estructurar y simplificar la información reduciendo la sobrecarga cognitiva:</w:t>
+        <w:t xml:space="preserve">Desde la perspectiva de la cibernética organizacional y siguiendo las directrices de José Pérez Ríos [2] y Stafford Beer [1], la </w:t>
+      </w:r>
+      <w:r>
+        <w:rPr>
+          <w:rFonts w:ascii="Arial" w:cs="Arial" w:eastAsia="Arial" w:hAnsi="Arial"/>
+          <w:b/>
+          <w:bCs/>
+          <w:sz w:val="22"/>
+          <w:szCs w:val="22"/>
+        </w:rPr>
+        <w:t xml:space="preserve">Sala de Operaciones Virtual</w:t>
+      </w:r>
+      <w:r>
+        <w:rPr>
+          <w:rFonts w:ascii="Arial" w:cs="Arial" w:eastAsia="Arial" w:hAnsi="Arial"/>
+          <w:sz w:val="22"/>
+          <w:szCs w:val="22"/>
+        </w:rPr>
+        <w:t xml:space="preserve"> no es un simple tablero de control visual; es un espacio cibernético estructurado para asistir al </w:t>
+      </w:r>
+      <w:r>
+        <w:rPr>
+          <w:rFonts w:ascii="Arial" w:cs="Arial" w:eastAsia="Arial" w:hAnsi="Arial"/>
+          <w:b/>
+          <w:bCs/>
+          <w:sz w:val="22"/>
+          <w:szCs w:val="22"/>
+        </w:rPr>
+        <w:t xml:space="preserve">Metasistema (Sistemas 3, 4 y 5)</w:t>
+      </w:r>
+      <w:r>
+        <w:rPr>
+          <w:rFonts w:ascii="Arial" w:cs="Arial" w:eastAsia="Arial" w:hAnsi="Arial"/>
+          <w:sz w:val="22"/>
+          <w:szCs w:val="22"/>
+        </w:rPr>
+        <w:t xml:space="preserve">. Su propósito fundamental es </w:t>
+      </w:r>
+      <w:r>
+        <w:rPr>
+          <w:rFonts w:ascii="Arial" w:cs="Arial" w:eastAsia="Arial" w:hAnsi="Arial"/>
+          <w:b/>
+          <w:bCs/>
+          <w:sz w:val="22"/>
+          <w:szCs w:val="22"/>
+        </w:rPr>
+        <w:t xml:space="preserve">atenuar y estructurar la variedad de datos brutos</w:t>
+      </w:r>
+      <w:r>
+        <w:rPr>
+          <w:rFonts w:ascii="Arial" w:cs="Arial" w:eastAsia="Arial" w:hAnsi="Arial"/>
+          <w:sz w:val="22"/>
+          <w:szCs w:val="22"/>
+        </w:rPr>
+        <w:t xml:space="preserve">, convirtiéndola en información inteligible sobre tres horizontes temporales (pasado, presente y futuro) para orientar el equilibrio adaptativo de la organización [2], [4].</w:t>
+      </w:r>
+    </w:p>
+    <w:p>
+      <w:pPr>
+        <w:spacing w:after="120"/>
+      </w:pPr>
+      <w:r>
+        <w:rPr>
+          <w:rFonts w:ascii="Arial" w:cs="Arial" w:eastAsia="Arial" w:hAnsi="Arial"/>
+          <w:sz w:val="22"/>
+          <w:szCs w:val="22"/>
+        </w:rPr>
+        <w:t xml:space="preserve">Este diseño aborda directamente la </w:t>
+      </w:r>
+      <w:r>
+        <w:rPr>
+          <w:rFonts w:ascii="Arial" w:cs="Arial" w:eastAsia="Arial" w:hAnsi="Arial"/>
+          <w:b/>
+          <w:bCs/>
+          <w:sz w:val="22"/>
+          <w:szCs w:val="22"/>
+        </w:rPr>
+        <w:t xml:space="preserve">Ley de Miller</w:t>
+      </w:r>
+      <w:r>
+        <w:rPr>
+          <w:rFonts w:ascii="Arial" w:cs="Arial" w:eastAsia="Arial" w:hAnsi="Arial"/>
+          <w:sz w:val="22"/>
+          <w:szCs w:val="22"/>
+        </w:rPr>
+        <w:t xml:space="preserve"> sobre los límites del procesamiento de la atención humana (7 ± 2 fragmentos cognitivos concurrentes) [10]. Al filtrar la complejidad del entorno a través de sensores específicos y transductores automatizados, la Sala de Operaciones evita que el Sistema 3 (Gestión Operativa) colapse bajo la patología de la </w:t>
+      </w:r>
+      <w:r>
+        <w:rPr>
+          <w:rFonts w:ascii="Arial" w:cs="Arial" w:eastAsia="Arial" w:hAnsi="Arial"/>
+          <w:b/>
+          <w:bCs/>
+          <w:sz w:val="22"/>
+          <w:szCs w:val="22"/>
+        </w:rPr>
+        <w:t xml:space="preserve">Hipertrofia del S3</w:t>
+      </w:r>
+      <w:r>
+        <w:rPr>
+          <w:rFonts w:ascii="Arial" w:cs="Arial" w:eastAsia="Arial" w:hAnsi="Arial"/>
+          <w:sz w:val="22"/>
+          <w:szCs w:val="22"/>
+        </w:rPr>
+        <w:t xml:space="preserve"> (microgestión desestructurada) [5]. Asimismo, actúa como el soporte físico e informático del </w:t>
+      </w:r>
+      <w:r>
+        <w:rPr>
+          <w:rFonts w:ascii="Arial" w:cs="Arial" w:eastAsia="Arial" w:hAnsi="Arial"/>
+          <w:b/>
+          <w:bCs/>
+          <w:sz w:val="22"/>
+          <w:szCs w:val="22"/>
+        </w:rPr>
+        <w:t xml:space="preserve">Homeostato S3-S4</w:t>
+      </w:r>
+      <w:r>
+        <w:rPr>
+          <w:rFonts w:ascii="Arial" w:cs="Arial" w:eastAsia="Arial" w:hAnsi="Arial"/>
+          <w:sz w:val="22"/>
+          <w:szCs w:val="22"/>
+        </w:rPr>
+        <w:t xml:space="preserve">, regulando la tensión natural entre la estabilidad de la operación (“aquí y ahora”) y la necesidad de cambio para la adaptación (“afuera y mañana”) [2], [7].</w:t>
+      </w:r>
+    </w:p>
+    <w:p>
+      <w:pPr>
+        <w:spacing w:after="120"/>
+      </w:pPr>
+      <w:r>
+        <w:rPr>
+          <w:rFonts w:ascii="Arial" w:cs="Arial" w:eastAsia="Arial" w:hAnsi="Arial"/>
+          <w:sz w:val="22"/>
+          <w:szCs w:val="22"/>
+        </w:rPr>
+        <w:t xml:space="preserve">De acuerdo con el marco del MSV, la Sala de Operaciones Virtual se organiza estrictamente en </w:t>
+      </w:r>
+      <w:r>
+        <w:rPr>
+          <w:rFonts w:ascii="Arial" w:cs="Arial" w:eastAsia="Arial" w:hAnsi="Arial"/>
+          <w:b/>
+          <w:bCs/>
+          <w:sz w:val="22"/>
+          <w:szCs w:val="22"/>
+        </w:rPr>
+        <w:t xml:space="preserve">5 pantallas interactivas</w:t>
+      </w:r>
+      <w:r>
+        <w:rPr>
+          <w:rFonts w:ascii="Arial" w:cs="Arial" w:eastAsia="Arial" w:hAnsi="Arial"/>
+          <w:sz w:val="22"/>
+          <w:szCs w:val="22"/>
+        </w:rPr>
+        <w:t xml:space="preserve"> especializadas:</w:t>
       </w:r>
     </w:p>
     <w:p>
@@ -3250,15 +3400,15 @@
           <w:sz w:val="22"/>
           <w:szCs w:val="22"/>
         </w:rPr>
-        <w:t xml:space="preserve">Pantalla 1 — El Presente (S3):</w:t>
-      </w:r>
-      <w:r>
-        <w:rPr>
-          <w:rFonts w:ascii="Arial" w:cs="Arial" w:eastAsia="Arial" w:hAnsi="Arial"/>
-          <w:sz w:val="22"/>
-          <w:szCs w:val="22"/>
-        </w:rPr>
-        <w:t xml:space="preserve"> Visualiza las variables críticas del “aquí y ahora” de la operación (Uptime de base de datos Supabase, latencia RAG actual, tickets de soporte activos, cuota de APIs consumida).</w:t>
+        <w:t xml:space="preserve">Pantalla 1 — El Presente (Desempeño Operativo y Semáforos de S3): </w:t>
+      </w:r>
+      <w:r>
+        <w:rPr>
+          <w:rFonts w:ascii="Arial" w:cs="Arial" w:eastAsia="Arial" w:hAnsi="Arial"/>
+          <w:sz w:val="22"/>
+          <w:szCs w:val="22"/>
+        </w:rPr>
+        <w:t xml:space="preserve">Regula la viabilidad del día a día mediante el principio de "gestión por excepción". Utiliza un sistema visual de semáforos tricolores (verde, amarillo, rojo) [2], [18]. Muestra variables del Sistema 2 como el Uptime de servicios (UptimeRobot) [17], tasa de excepciones (Sentry) [17], consumo en tiempo real de APIs [13], [14] y WAU / retención D7 de PostHog/Google Analytics [11].</w:t>
       </w:r>
     </w:p>
     <w:p>
@@ -3278,15 +3428,15 @@
           <w:sz w:val="22"/>
           <w:szCs w:val="22"/>
         </w:rPr>
-        <w:t xml:space="preserve">Pantalla 2 — El Pasado (S3):</w:t>
-      </w:r>
-      <w:r>
-        <w:rPr>
-          <w:rFonts w:ascii="Arial" w:cs="Arial" w:eastAsia="Arial" w:hAnsi="Arial"/>
-          <w:sz w:val="22"/>
-          <w:szCs w:val="22"/>
-        </w:rPr>
-        <w:t xml:space="preserve"> Gráficos de evolución histórica que muestran trayectorias y tendencias de los meses previos (crecimiento de usuarios activos semanales — WAU, histórico de costo de APIs, evolución del Churn rate y retención D7 histórica).</w:t>
+        <w:t xml:space="preserve">Pantalla 2 — El Pasado (Tendencias y Auditoría de S3*): </w:t>
+      </w:r>
+      <w:r>
+        <w:rPr>
+          <w:rFonts w:ascii="Arial" w:cs="Arial" w:eastAsia="Arial" w:hAnsi="Arial"/>
+          <w:sz w:val="22"/>
+          <w:szCs w:val="22"/>
+        </w:rPr>
+        <w:t xml:space="preserve">Provee el contexto histórico del comportamiento del sistema para identificar patrones recurrentes, ciclos de estacionalidad académica y deudas técnicas acumuladas [2], [10]. Despliega curvas de WAU, Costo de APIs, Churn y el historial de auditorías del canal S3* [2], [16].</w:t>
       </w:r>
     </w:p>
     <w:p>
@@ -3306,51 +3456,15 @@
           <w:sz w:val="22"/>
           <w:szCs w:val="22"/>
         </w:rPr>
-        <w:t xml:space="preserve">Pantalla 3 — El Futuro y Simulación (S4):</w:t>
-      </w:r>
-      <w:r>
-        <w:rPr>
-          <w:rFonts w:ascii="Arial" w:cs="Arial" w:eastAsia="Arial" w:hAnsi="Arial"/>
-          <w:sz w:val="22"/>
-          <w:szCs w:val="22"/>
-        </w:rPr>
-        <w:t xml:space="preserve"> Pantalla interactiva que aloja los simuladores de los Modelos </w:t>
-      </w:r>
-      <w:r>
-        <w:rPr>
-          <w:rFonts w:ascii="Arial" w:cs="Arial" w:eastAsia="Arial" w:hAnsi="Arial"/>
-          <w:b/>
-          <w:bCs/>
-          <w:sz w:val="22"/>
-          <w:szCs w:val="22"/>
-        </w:rPr>
-        <w:t xml:space="preserve">M2</w:t>
-      </w:r>
-      <w:r>
-        <w:rPr>
-          <w:rFonts w:ascii="Arial" w:cs="Arial" w:eastAsia="Arial" w:hAnsi="Arial"/>
-          <w:sz w:val="22"/>
-          <w:szCs w:val="22"/>
-        </w:rPr>
-        <w:t xml:space="preserve"> (Pérdida de Pilotos) y </w:t>
-      </w:r>
-      <w:r>
-        <w:rPr>
-          <w:rFonts w:ascii="Arial" w:cs="Arial" w:eastAsia="Arial" w:hAnsi="Arial"/>
-          <w:b/>
-          <w:bCs/>
-          <w:sz w:val="22"/>
-          <w:szCs w:val="22"/>
-        </w:rPr>
-        <w:t xml:space="preserve">M5</w:t>
-      </w:r>
-      <w:r>
-        <w:rPr>
-          <w:rFonts w:ascii="Arial" w:cs="Arial" w:eastAsia="Arial" w:hAnsi="Arial"/>
-          <w:sz w:val="22"/>
-          <w:szCs w:val="22"/>
-        </w:rPr>
-        <w:t xml:space="preserve"> (Penetración EdTech y Regulaciones SUNEDU) bajo la metodología de Dinámica de Sistemas. Permite correr escenarios “qué pasaría si” (What-if) modificando variables de entrada en tiempo real.</w:t>
+        <w:t xml:space="preserve">Pantalla 3 — El Futuro y Simulación (Prospectiva de S4): </w:t>
+      </w:r>
+      <w:r>
+        <w:rPr>
+          <w:rFonts w:ascii="Arial" w:cs="Arial" w:eastAsia="Arial" w:hAnsi="Arial"/>
+          <w:sz w:val="22"/>
+          <w:szCs w:val="22"/>
+        </w:rPr>
+        <w:t xml:space="preserve">Es el motor del Sistema 4. Permite simular el impacto de decisiones alternativas frente a variaciones dinámicas del entorno (“What-if”) mediante Dinámica de Sistemas (Vensim, Ithink o Google Sheets) [2], [8]. Aloja el Modelo M1 (costo y escala) [13], [14], Modelo M2 (pérdida de pilotos B2B) [8], Modelo M3 (disponibilidad) [9] y el Modelo M5 (regulaciones SUNEDU a 5 años) [3], [24].</w:t>
       </w:r>
     </w:p>
     <w:p>
@@ -3370,15 +3484,15 @@
           <w:sz w:val="22"/>
           <w:szCs w:val="22"/>
         </w:rPr>
-        <w:t xml:space="preserve">Pantalla 4 — El Modelo Ciberténico:</w:t>
-      </w:r>
-      <w:r>
-        <w:rPr>
-          <w:rFonts w:ascii="Arial" w:cs="Arial" w:eastAsia="Arial" w:hAnsi="Arial"/>
-          <w:sz w:val="22"/>
-          <w:szCs w:val="22"/>
-        </w:rPr>
-        <w:t xml:space="preserve"> Representación gráfica e interactiva de la estructura del Modelo de Sistema Viable (MSV) de Synapta. Mapea las relaciones homeostáticas entre los Sistemas 1 a 5 e identifica visualmente qué canales presentan fallas de transducción o patologías de filtrado.</w:t>
+        <w:t xml:space="preserve">Pantalla 4 — El Modelo Ciberténico (VSMod®): </w:t>
+      </w:r>
+      <w:r>
+        <w:rPr>
+          <w:rFonts w:ascii="Arial" w:cs="Arial" w:eastAsia="Arial" w:hAnsi="Arial"/>
+          <w:sz w:val="22"/>
+          <w:szCs w:val="22"/>
+        </w:rPr>
+        <w:t xml:space="preserve">Provee una representación topológica e interactiva de la estructura de la organización en todos sus niveles de recursión (Ingeniería, Growth, Ventas y Soporte), visualizando el estado de los canales de comunicación, transducción y patologías en los homeostatos [2], [5].</w:t>
       </w:r>
     </w:p>
     <w:p>
@@ -3398,15 +3512,15 @@
           <w:sz w:val="22"/>
           <w:szCs w:val="22"/>
         </w:rPr>
-        <w:t xml:space="preserve">Pantalla 5 — Información Complementaria:</w:t>
-      </w:r>
-      <w:r>
-        <w:rPr>
-          <w:rFonts w:ascii="Arial" w:cs="Arial" w:eastAsia="Arial" w:hAnsi="Arial"/>
-          <w:sz w:val="22"/>
-          <w:szCs w:val="22"/>
-        </w:rPr>
-        <w:t xml:space="preserve"> Acceso a feeds de arXiv, matriz actualizada de competidores directos, base de conocimientos legal (SUNEDU/APDP), reportes de retroalimentación de usuarios en Discord y grabaciones de demos de ventas B2B.</w:t>
+        <w:t xml:space="preserve">Pantalla 5 — Información Complementaria (Vigilancia del Entorno): </w:t>
+      </w:r>
+      <w:r>
+        <w:rPr>
+          <w:rFonts w:ascii="Arial" w:cs="Arial" w:eastAsia="Arial" w:hAnsi="Arial"/>
+          <w:sz w:val="22"/>
+          <w:szCs w:val="22"/>
+        </w:rPr>
+        <w:t xml:space="preserve">Filtra la variedad del entorno externo mediante feeds de arXiv (NLP/RAG) [13], alertas de SUNEDU/APDP (Ley N° 29733) [22], [23], matrices cualitativas de competidores (Anki, RemNote, Notion AI) [25] e hilos de retroalimentación de Discord.</w:t>
       </w:r>
     </w:p>
     <w:p>

</xml_diff>